<commit_message>
Evaluate with hand counts and a circle-by-circle review
Replace the preliminary counts with the author's hand counts and add
detection_review.csv (TP/FP/FN per photo, FP causes) plus the Excel
study sheet. run.py now reports TP/FP/FN, precision and recall instead
of button counts; report, poster, figures and README use the new data.

Co-Authored-By: Claude Opus 5.5 (1M context) <noreply@anthropic.com>
</commit_message>
<xml_diff>
--- a/report/Every_Coin_Counts_Poster.docx
+++ b/report/Every_Coin_Counts_Poster.docx
@@ -273,7 +273,7 @@
                 <w:sz w:val="64"/>
                 <w:szCs w:val="64"/>
               </w:rPr>
-              <w:t xml:space="preserve">90.29%</w:t>
+              <w:t xml:space="preserve">89.6%</w:t>
             </w:r>
           </w:p>
           <w:p>
@@ -290,7 +290,7 @@
                 <w:sz w:val="24"/>
                 <w:szCs w:val="24"/>
               </w:rPr>
-              <w:t xml:space="preserve">count accuracy</w:t>
+              <w:t xml:space="preserve">recall</w:t>
             </w:r>
           </w:p>
           <w:p>
@@ -305,7 +305,7 @@
                 <w:sz w:val="19"/>
                 <w:szCs w:val="19"/>
               </w:rPr>
-              <w:t xml:space="preserve">33 coins off out of 340</w:t>
+              <w:t xml:space="preserve">294 of 328 coins found</w:t>
             </w:r>
           </w:p>
         </w:tc>
@@ -341,7 +341,7 @@
                 <w:sz w:val="64"/>
                 <w:szCs w:val="64"/>
               </w:rPr>
-              <w:t xml:space="preserve">1.27</w:t>
+              <w:t xml:space="preserve">88.3%</w:t>
             </w:r>
           </w:p>
           <w:p>
@@ -358,7 +358,7 @@
                 <w:sz w:val="24"/>
                 <w:szCs w:val="24"/>
               </w:rPr>
-              <w:t xml:space="preserve">mean abs. error</w:t>
+              <w:t xml:space="preserve">precision</w:t>
             </w:r>
           </w:p>
           <w:p>
@@ -373,7 +373,7 @@
                 <w:sz w:val="19"/>
                 <w:szCs w:val="19"/>
               </w:rPr>
-              <w:t xml:space="preserve">coins per photo</w:t>
+              <w:t xml:space="preserve">294 of 333 detections were coins</w:t>
             </w:r>
           </w:p>
         </w:tc>
@@ -409,7 +409,7 @@
                 <w:sz w:val="64"/>
                 <w:szCs w:val="64"/>
               </w:rPr>
-              <w:t xml:space="preserve">11/26</w:t>
+              <w:t xml:space="preserve">39 / 34</w:t>
             </w:r>
           </w:p>
           <w:p>
@@ -426,7 +426,7 @@
                 <w:sz w:val="24"/>
                 <w:szCs w:val="24"/>
               </w:rPr>
-              <w:t xml:space="preserve">exact photos</w:t>
+              <w:t xml:space="preserve">false / missed</w:t>
             </w:r>
           </w:p>
           <w:p>
@@ -441,7 +441,7 @@
                 <w:sz w:val="19"/>
                 <w:szCs w:val="19"/>
               </w:rPr>
-              <w:t xml:space="preserve">19/26 within ±1 coin</w:t>
+              <w:t xml:space="preserve">FP non-coins · FN missed coins</w:t>
             </w:r>
           </w:p>
         </w:tc>
@@ -477,7 +477,7 @@
                 <w:sz w:val="64"/>
                 <w:szCs w:val="64"/>
               </w:rPr>
-              <w:t xml:space="preserve">9/12</w:t>
+              <w:t xml:space="preserve">12/26</w:t>
             </w:r>
           </w:p>
           <w:p>
@@ -494,7 +494,7 @@
                 <w:sz w:val="24"/>
                 <w:szCs w:val="24"/>
               </w:rPr>
-              <w:t xml:space="preserve">buttons excluded</w:t>
+              <w:t xml:space="preserve">exact counts</w:t>
             </w:r>
           </w:p>
           <w:p>
@@ -509,7 +509,7 @@
                 <w:sz w:val="19"/>
                 <w:szCs w:val="19"/>
               </w:rPr>
-              <w:t xml:space="preserve">by holes or colour</w:t>
+              <w:t xml:space="preserve">only 7 with no mistake at all</w:t>
             </w:r>
           </w:p>
         </w:tc>
@@ -645,7 +645,7 @@
                 <w:sz w:val="23"/>
                 <w:szCs w:val="23"/>
               </w:rPr>
-              <w:t xml:space="preserve">26 photos · 340 coins · 12 buttons, hand-counted and split into clean, noisy (dark / blurred) and damaged (piles, cut coins, buttons). A synthetic image with 6 discs checked the code: 6 of 6 found.</w:t>
+              <w:t xml:space="preserve">26 photos · 328 coins · 12 buttons, hand-counted and split into clean, noisy (dark / blurred) and damaged (piles, cut coins, buttons). Then every circle the program drew was checked: coin (TP), not a coin (FP) or a coin without a circle (FN).</w:t>
             </w:r>
           </w:p>
         </w:tc>
@@ -1147,7 +1147,7 @@
                 <w:sz w:val="19"/>
                 <w:szCs w:val="19"/>
               </w:rPr>
-              <w:t xml:space="preserve">Exact counts on clean and dark photos.</w:t>
+              <w:t xml:space="preserve">Three clean photos with no mistake.</w:t>
             </w:r>
           </w:p>
           <w:p>
@@ -1161,7 +1161,7 @@
                 <w:sz w:val="23"/>
                 <w:szCs w:val="23"/>
               </w:rPr>
-              <w:t xml:space="preserve">Clean photos: MAE 0.13, all within one coin. About 0.7 s per 1600 × 900 photo.</w:t>
+              <w:t xml:space="preserve">Clean photos: all 98 coins found, 1 false detection. Dark photos add false coins; piles and the frame hide real ones.</w:t>
             </w:r>
           </w:p>
         </w:tc>
@@ -1231,7 +1231,7 @@
                 <w:sz w:val="34"/>
                 <w:szCs w:val="34"/>
               </w:rPr>
-              <w:t xml:space="preserve"> What made it work</w:t>
+              <w:t xml:space="preserve"> What was mistaken for a coin</w:t>
             </w:r>
           </w:p>
           <w:p>
@@ -1242,7 +1242,7 @@
             <w:r>
               <w:drawing>
                 <wp:inline distT="0" distB="0" distL="0" distR="0">
-                  <wp:extent cx="3171825" cy="1524000"/>
+                  <wp:extent cx="3171825" cy="1447800"/>
                   <wp:effectExtent t="0" r="0" b="0" l="0"/>
                   <wp:docPr id="4" name="" descr="" title=""/>
                   <wp:cNvGraphicFramePr>
@@ -1267,7 +1267,7 @@
                         <pic:spPr bwMode="auto">
                           <a:xfrm>
                             <a:off x="0" y="0"/>
-                            <a:ext cx="3171825" cy="1524000"/>
+                            <a:ext cx="3171825" cy="1447800"/>
                           </a:xfrm>
                           <a:prstGeom prst="rect">
                             <a:avLst/>
@@ -1292,7 +1292,7 @@
                 <w:sz w:val="19"/>
                 <w:szCs w:val="19"/>
               </w:rPr>
-              <w:t xml:space="preserve">Error after each development step.</w:t>
+              <w:t xml:space="preserve">Causes of the 39 false positives.</w:t>
             </w:r>
           </w:p>
           <w:p>
@@ -1306,7 +1306,7 @@
                 <w:sz w:val="23"/>
                 <w:szCs w:val="23"/>
               </w:rPr>
-              <w:t xml:space="preserve">Pad folds fooled every early version. The Hessian test, round versus ridge, cut the error by more than half.</w:t>
+              <w:t xml:space="preserve">12 photos got the exact total, but in 5 of them a false coin and a missed coin cancelled out.</w:t>
             </w:r>
           </w:p>
         </w:tc>
@@ -1376,7 +1376,7 @@
                 <w:sz w:val="34"/>
                 <w:szCs w:val="34"/>
               </w:rPr>
-              <w:t xml:space="preserve"> Coins vs. buttons</w:t>
+              <w:t xml:space="preserve"> Round, but not a coin</w:t>
             </w:r>
           </w:p>
           <w:p>
@@ -1387,7 +1387,7 @@
             <w:r>
               <w:drawing>
                 <wp:inline distT="0" distB="0" distL="0" distR="0">
-                  <wp:extent cx="3171825" cy="1343025"/>
+                  <wp:extent cx="3171825" cy="1295400"/>
                   <wp:effectExtent t="0" r="0" b="0" l="0"/>
                   <wp:docPr id="5" name="" descr="" title=""/>
                   <wp:cNvGraphicFramePr>
@@ -1412,7 +1412,7 @@
                         <pic:spPr bwMode="auto">
                           <a:xfrm>
                             <a:off x="0" y="0"/>
-                            <a:ext cx="3171825" cy="1343025"/>
+                            <a:ext cx="3171825" cy="1295400"/>
                           </a:xfrm>
                           <a:prstGeom prst="rect">
                             <a:avLst/>
@@ -1451,7 +1451,7 @@
                 <w:sz w:val="23"/>
                 <w:szCs w:val="23"/>
               </w:rPr>
-              <w:t xml:space="preserve">Blue, navy and pink buttons fail the colour test; for the rest, black-hat reveals 2–4 sewing holes around the centre.</w:t>
+              <w:t xml:space="preserve">9 of 12 buttons rejected by colour or sewing holes (black-hat); 2 grey buttons passed as coins.</w:t>
             </w:r>
           </w:p>
         </w:tc>
@@ -1536,7 +1536,7 @@
                 <w:sz w:val="23"/>
                 <w:szCs w:val="23"/>
               </w:rPr>
-              <w:t xml:space="preserve">Classical tools alone reached 90.29% count accuracy and excluded 9 of 12 buttons. Shape (Hessian) beat brightness for ignoring folds, and LoG + Hough together handled blurry and touching coins.</w:t>
+              <w:t xml:space="preserve">Classical tools alone found 89.6% of the coins with 88.3% precision and rejected 9 of 12 buttons. Checking every circle, not just the total, showed where and why the machine fails.</w:t>
             </w:r>
           </w:p>
         </w:tc>
@@ -1586,7 +1586,7 @@
                 <w:sz w:val="23"/>
                 <w:szCs w:val="23"/>
               </w:rPr>
-              <w:t xml:space="preserve">Strong motion blur splits a coin into several blobs (22 vs 14). Dense piles hide coins, coins cut by the frame are half-circles, and a grey button without visible holes looks like a coin.</w:t>
+              <w:t xml:space="preserve">Motion blur splits a coin into several blobs (22 counted vs 12). Dense piles hide coins, coins cut by the frame are half-circles, and a grey button without visible holes looks like a coin.</w:t>
             </w:r>
           </w:p>
         </w:tc>
@@ -1636,7 +1636,7 @@
                 <w:sz w:val="23"/>
                 <w:szCs w:val="23"/>
               </w:rPr>
-              <w:t xml:space="preserve">Merge detections along the blur direction, fit partial circles at the image border, use rim colour for grey buttons, and mark coin positions to separate false positives from misses.</w:t>
+              <w:t xml:space="preserve">Merge detections along the blur direction, drop the white hem from the pad mask, fit partial circles at the image border, and use rim colour to catch grey buttons.</w:t>
             </w:r>
           </w:p>
         </w:tc>

</xml_diff>

<commit_message>
Fix instructor name spelling (Lustig)
Co-Authored-By: Claude Opus 5.5 (1M context) <noreply@anthropic.com>
</commit_message>
<xml_diff>
--- a/report/Every_Coin_Counts_Poster.docx
+++ b/report/Every_Coin_Counts_Poster.docx
@@ -24,12 +24,6 @@
         <w:gridCol w:w="5303"/>
       </w:tblGrid>
       <w:tr>
-        <w:tblPrEx>
-          <w:tblCellMar>
-            <w:top w:w="0" w:type="dxa"/>
-            <w:bottom w:w="0" w:type="dxa"/>
-          </w:tblCellMar>
-        </w:tblPrEx>
         <w:tc>
           <w:tcPr>
             <w:tcW w:w="10295" w:type="dxa"/>
@@ -61,31 +55,7 @@
                 <w:sz w:val="22"/>
                 <w:szCs w:val="22"/>
               </w:rPr>
-              <w:t xml:space="preserve">IMAGE </w:t>
-            </w:r>
-            <w:proofErr w:type="gramStart"/>
-            <w:r>
-              <w:rPr>
-                <w:b/>
-                <w:bCs/>
-                <w:color w:val="A9E3C6"/>
-                <w:spacing w:val="40"/>
-                <w:sz w:val="22"/>
-                <w:szCs w:val="22"/>
-              </w:rPr>
-              <w:t>PROCESSING  ·</w:t>
-            </w:r>
-            <w:proofErr w:type="gramEnd"/>
-            <w:r>
-              <w:rPr>
-                <w:b/>
-                <w:bCs/>
-                <w:color w:val="A9E3C6"/>
-                <w:spacing w:val="40"/>
-                <w:sz w:val="22"/>
-                <w:szCs w:val="22"/>
-              </w:rPr>
-              <w:t xml:space="preserve">  FINAL PROJECT</w:t>
+              <w:t>IMAGE PROCESSING  ·  FINAL PROJECT</w:t>
             </w:r>
           </w:p>
           <w:p>
@@ -198,7 +168,15 @@
                 <w:sz w:val="26"/>
                 <w:szCs w:val="26"/>
               </w:rPr>
-              <w:t>Dr. Cornel Lusting</w:t>
+              <w:t xml:space="preserve">Dr. Cornel </w:t>
+            </w:r>
+            <w:r>
+              <w:rPr>
+                <w:color w:val="FFFFFF"/>
+                <w:sz w:val="26"/>
+                <w:szCs w:val="26"/>
+              </w:rPr>
+              <w:t>Lustig</w:t>
             </w:r>
           </w:p>
           <w:p>
@@ -216,59 +194,7 @@
                 <w:sz w:val="22"/>
                 <w:szCs w:val="22"/>
               </w:rPr>
-              <w:t xml:space="preserve">Holon </w:t>
-            </w:r>
-            <w:proofErr w:type="gramStart"/>
-            <w:r>
-              <w:rPr>
-                <w:color w:val="D6E4F5"/>
-                <w:sz w:val="22"/>
-                <w:szCs w:val="22"/>
-              </w:rPr>
-              <w:t>institute</w:t>
-            </w:r>
-            <w:proofErr w:type="gramEnd"/>
-            <w:r>
-              <w:rPr>
-                <w:color w:val="D6E4F5"/>
-                <w:sz w:val="22"/>
-                <w:szCs w:val="22"/>
-              </w:rPr>
-              <w:t xml:space="preserve"> of Technology </w:t>
-            </w:r>
-            <w:proofErr w:type="gramStart"/>
-            <w:r>
-              <w:rPr>
-                <w:color w:val="D6E4F5"/>
-                <w:sz w:val="22"/>
-                <w:szCs w:val="22"/>
-              </w:rPr>
-              <w:t>HIT</w:t>
-            </w:r>
-            <w:r>
-              <w:rPr>
-                <w:color w:val="D6E4F5"/>
-                <w:sz w:val="22"/>
-                <w:szCs w:val="22"/>
-              </w:rPr>
-              <w:t xml:space="preserve">  ·</w:t>
-            </w:r>
-            <w:proofErr w:type="gramEnd"/>
-            <w:r>
-              <w:rPr>
-                <w:color w:val="D6E4F5"/>
-                <w:sz w:val="22"/>
-                <w:szCs w:val="22"/>
-              </w:rPr>
-              <w:t xml:space="preserve"> </w:t>
-            </w:r>
-            <w:r>
-              <w:rPr>
-                <w:color w:val="D6E4F5"/>
-                <w:sz w:val="22"/>
-                <w:szCs w:val="22"/>
-              </w:rPr>
-              <w:t>summer 2026</w:t>
+              <w:t>Holon institute of Technology HIT  · summer 2026</w:t>
             </w:r>
           </w:p>
         </w:tc>
@@ -306,12 +232,6 @@
         <w:gridCol w:w="3901"/>
       </w:tblGrid>
       <w:tr>
-        <w:tblPrEx>
-          <w:tblCellMar>
-            <w:top w:w="0" w:type="dxa"/>
-            <w:bottom w:w="0" w:type="dxa"/>
-          </w:tblCellMar>
-        </w:tblPrEx>
         <w:tc>
           <w:tcPr>
             <w:tcW w:w="3899" w:type="dxa"/>
@@ -560,25 +480,7 @@
                 <w:sz w:val="19"/>
                 <w:szCs w:val="19"/>
               </w:rPr>
-              <w:t xml:space="preserve">only 7 with no </w:t>
-            </w:r>
-            <w:proofErr w:type="gramStart"/>
-            <w:r>
-              <w:rPr>
-                <w:color w:val="5F6B7A"/>
-                <w:sz w:val="19"/>
-                <w:szCs w:val="19"/>
-              </w:rPr>
-              <w:t>mistake</w:t>
-            </w:r>
-            <w:proofErr w:type="gramEnd"/>
-            <w:r>
-              <w:rPr>
-                <w:color w:val="5F6B7A"/>
-                <w:sz w:val="19"/>
-                <w:szCs w:val="19"/>
-              </w:rPr>
-              <w:t xml:space="preserve"> at all</w:t>
+              <w:t>only 7 with no mistake at all</w:t>
             </w:r>
           </w:p>
         </w:tc>
@@ -612,12 +514,6 @@
         <w:gridCol w:w="8375"/>
       </w:tblGrid>
       <w:tr>
-        <w:tblPrEx>
-          <w:tblCellMar>
-            <w:top w:w="0" w:type="dxa"/>
-            <w:bottom w:w="0" w:type="dxa"/>
-          </w:tblCellMar>
-        </w:tblPrEx>
         <w:tc>
           <w:tcPr>
             <w:tcW w:w="6863" w:type="dxa"/>
@@ -658,13 +554,8 @@
               <w:spacing w:after="100" w:line="260" w:lineRule="auto"/>
             </w:pPr>
             <w:r>
-              <w:t xml:space="preserve">People count coins </w:t>
-            </w:r>
-            <w:proofErr w:type="gramStart"/>
-            <w:r>
-              <w:t>at a glance</w:t>
-            </w:r>
-            <w:proofErr w:type="gramEnd"/>
+              <w:t>People count coins at a glance</w:t>
+            </w:r>
             <w:r>
               <w:t>; a computer sees only pixels. Our phone photos add three traps: a white pad full of folds and seams, dark or motion-blurred shots, and buttons the size of a coin mixed in.</w:t>
             </w:r>
@@ -673,7 +564,6 @@
             <w:pPr>
               <w:spacing w:after="100" w:line="260" w:lineRule="auto"/>
             </w:pPr>
-            <w:proofErr w:type="gramStart"/>
             <w:r>
               <w:rPr>
                 <w:b/>
@@ -683,18 +573,13 @@
               <w:t xml:space="preserve">Question  </w:t>
             </w:r>
             <w:r>
-              <w:t>Can</w:t>
-            </w:r>
-            <w:proofErr w:type="gramEnd"/>
-            <w:r>
-              <w:t xml:space="preserve"> fixed classical rules, with no training, count only the coins under these conditions?</w:t>
+              <w:t>Can fixed classical rules, with no training, count only the coins under these conditions?</w:t>
             </w:r>
           </w:p>
           <w:p>
             <w:pPr>
               <w:spacing w:after="100" w:line="260" w:lineRule="auto"/>
             </w:pPr>
-            <w:proofErr w:type="gramStart"/>
             <w:r>
               <w:rPr>
                 <w:b/>
@@ -704,17 +589,8 @@
               <w:t xml:space="preserve">Data  </w:t>
             </w:r>
             <w:r>
-              <w:t>26</w:t>
-            </w:r>
-            <w:proofErr w:type="gramEnd"/>
-            <w:r>
-              <w:t xml:space="preserve"> photos · 328 coins · 12 buttons, hand-counted and split into clean, noisy (dark / blurred) and damaged (piles</w:t>
-            </w:r>
-            <w:proofErr w:type="gramStart"/>
-            <w:r>
-              <w:t>, cut</w:t>
-            </w:r>
-            <w:proofErr w:type="gramEnd"/>
+              <w:t>26 photos · 328 coins · 12 buttons, hand-counted and split into clean, noisy (dark / blurred) and damaged (piles, cut</w:t>
+            </w:r>
             <w:r>
               <w:t xml:space="preserve"> coins, buttons). Then every circle the program drew was checked: coin (TP), not a coin (FP) or a coin without a circle (FN).</w:t>
             </w:r>
@@ -919,15 +795,7 @@
               <w:t xml:space="preserve">Touching coins: </w:t>
             </w:r>
             <w:r>
-              <w:t xml:space="preserve">Hough circles split what </w:t>
-            </w:r>
-            <w:proofErr w:type="spellStart"/>
-            <w:r>
-              <w:t>LoG</w:t>
-            </w:r>
-            <w:proofErr w:type="spellEnd"/>
-            <w:r>
-              <w:t xml:space="preserve"> merges.</w:t>
+              <w:t>Hough circles split what LoG merges.</w:t>
             </w:r>
           </w:p>
           <w:p>
@@ -950,11 +818,9 @@
               </w:rPr>
               <w:t xml:space="preserve">Buttons: </w:t>
             </w:r>
-            <w:proofErr w:type="gramStart"/>
             <w:r>
               <w:t>black-hat</w:t>
             </w:r>
-            <w:proofErr w:type="gramEnd"/>
             <w:r>
               <w:t xml:space="preserve"> reveals sewing holes; blue or pink objects are never coins.</w:t>
             </w:r>
@@ -1046,25 +912,7 @@
           <w:sz w:val="19"/>
           <w:szCs w:val="19"/>
         </w:rPr>
-        <w:t xml:space="preserve">Input → foreground map → pad mask → </w:t>
-      </w:r>
-      <w:proofErr w:type="spellStart"/>
-      <w:r>
-        <w:rPr>
-          <w:color w:val="5F6B7A"/>
-          <w:sz w:val="19"/>
-          <w:szCs w:val="19"/>
-        </w:rPr>
-        <w:t>LoG</w:t>
-      </w:r>
-      <w:proofErr w:type="spellEnd"/>
-      <w:r>
-        <w:rPr>
-          <w:color w:val="5F6B7A"/>
-          <w:sz w:val="19"/>
-          <w:szCs w:val="19"/>
-        </w:rPr>
-        <w:t xml:space="preserve"> response → raw peaks (mostly folds) → 14 coins after verification.</w:t>
+        <w:t>Input → foreground map → pad mask → LoG response → raw peaks (mostly folds) → 14 coins after verification.</w:t>
       </w:r>
     </w:p>
     <w:tbl>
@@ -1092,12 +940,6 @@
         <w:gridCol w:w="5000"/>
       </w:tblGrid>
       <w:tr>
-        <w:tblPrEx>
-          <w:tblCellMar>
-            <w:top w:w="0" w:type="dxa"/>
-            <w:bottom w:w="0" w:type="dxa"/>
-          </w:tblCellMar>
-        </w:tblPrEx>
         <w:tc>
           <w:tcPr>
             <w:tcW w:w="4999" w:type="dxa"/>
@@ -1193,25 +1035,7 @@
                 <w:sz w:val="19"/>
                 <w:szCs w:val="19"/>
               </w:rPr>
-              <w:t xml:space="preserve">Three clean photos with no </w:t>
-            </w:r>
-            <w:proofErr w:type="gramStart"/>
-            <w:r>
-              <w:rPr>
-                <w:color w:val="5F6B7A"/>
-                <w:sz w:val="19"/>
-                <w:szCs w:val="19"/>
-              </w:rPr>
-              <w:t>mistake</w:t>
-            </w:r>
-            <w:proofErr w:type="gramEnd"/>
-            <w:r>
-              <w:rPr>
-                <w:color w:val="5F6B7A"/>
-                <w:sz w:val="19"/>
-                <w:szCs w:val="19"/>
-              </w:rPr>
-              <w:t>.</w:t>
+              <w:t>Three clean photos with no mistake.</w:t>
             </w:r>
           </w:p>
           <w:p>
@@ -1477,23 +1301,7 @@
               <w:spacing w:after="100" w:line="260" w:lineRule="auto"/>
             </w:pPr>
             <w:r>
-              <w:t xml:space="preserve">9 of 12 buttons rejected by </w:t>
-            </w:r>
-            <w:proofErr w:type="spellStart"/>
-            <w:r>
-              <w:t>colour</w:t>
-            </w:r>
-            <w:proofErr w:type="spellEnd"/>
-            <w:r>
-              <w:t xml:space="preserve"> or sewing holes (</w:t>
-            </w:r>
-            <w:proofErr w:type="gramStart"/>
-            <w:r>
-              <w:t>black-hat</w:t>
-            </w:r>
-            <w:proofErr w:type="gramEnd"/>
-            <w:r>
-              <w:t>); 2 grey buttons passed as coins.</w:t>
+              <w:t>9 of 12 buttons rejected by colour or sewing holes (black-hat); 2 grey buttons passed as coins.</w:t>
             </w:r>
           </w:p>
         </w:tc>
@@ -1527,12 +1335,6 @@
         <w:gridCol w:w="5200"/>
       </w:tblGrid>
       <w:tr>
-        <w:tblPrEx>
-          <w:tblCellMar>
-            <w:top w:w="0" w:type="dxa"/>
-            <w:bottom w:w="0" w:type="dxa"/>
-          </w:tblCellMar>
-        </w:tblPrEx>
         <w:tc>
           <w:tcPr>
             <w:tcW w:w="5199" w:type="dxa"/>
@@ -1655,15 +1457,7 @@
               <w:spacing w:line="260" w:lineRule="auto"/>
             </w:pPr>
             <w:r>
-              <w:t xml:space="preserve">Merge detections along the blur direction, drop the white hem from the pad mask, fit partial circles at the image border, and use rim </w:t>
-            </w:r>
-            <w:proofErr w:type="spellStart"/>
-            <w:r>
-              <w:t>colour</w:t>
-            </w:r>
-            <w:proofErr w:type="spellEnd"/>
-            <w:r>
-              <w:t xml:space="preserve"> to catch grey buttons.</w:t>
+              <w:t>Merge detections along the blur direction, drop the white hem from the pad mask, fit partial circles at the image border, and use rim colour to catch grey buttons.</w:t>
             </w:r>
           </w:p>
         </w:tc>

</xml_diff>

<commit_message>
Write report and poster in first person singular
Single-author project: we/our/us -> I/my/me, and add the missing "I"
in the introduction.

Co-Authored-By: Claude Opus 5.5 (1M context) <noreply@anthropic.com>
</commit_message>
<xml_diff>
--- a/report/Every_Coin_Counts_Poster.docx
+++ b/report/Every_Coin_Counts_Poster.docx
@@ -554,10 +554,13 @@
               <w:spacing w:after="100" w:line="260" w:lineRule="auto"/>
             </w:pPr>
             <w:r>
-              <w:t>People count coins at a glance</w:t>
-            </w:r>
-            <w:r>
-              <w:t>; a computer sees only pixels. Our phone photos add three traps: a white pad full of folds and seams, dark or motion-blurred shots, and buttons the size of a coin mixed in.</w:t>
+              <w:t xml:space="preserve">People count coins at a glance; a computer sees only pixels. </w:t>
+            </w:r>
+            <w:r>
+              <w:t>My phone photos</w:t>
+            </w:r>
+            <w:r>
+              <w:t xml:space="preserve"> add three traps: a white pad full of folds and seams, dark or motion-blurred shots, and buttons the size of a coin mixed in.</w:t>
             </w:r>
           </w:p>
           <w:p>
@@ -589,10 +592,7 @@
               <w:t xml:space="preserve">Data  </w:t>
             </w:r>
             <w:r>
-              <w:t>26 photos · 328 coins · 12 buttons, hand-counted and split into clean, noisy (dark / blurred) and damaged (piles, cut</w:t>
-            </w:r>
-            <w:r>
-              <w:t xml:space="preserve"> coins, buttons). Then every circle the program drew was checked: coin (TP), not a coin (FP) or a coin without a circle (FN).</w:t>
+              <w:t>26 photos · 328 coins · 12 buttons, hand-counted and split into clean, noisy (dark / blurred) and damaged (piles, cut coins, buttons). Then every circle the program drew was checked: coin (TP), not a coin (FP) or a coin without a circle (FN).</w:t>
             </w:r>
           </w:p>
         </w:tc>
@@ -819,10 +819,7 @@
               <w:t xml:space="preserve">Buttons: </w:t>
             </w:r>
             <w:r>
-              <w:t>black-hat</w:t>
-            </w:r>
-            <w:r>
-              <w:t xml:space="preserve"> reveals sewing holes; blue or pink objects are never coins.</w:t>
+              <w:t>black-hat reveals sewing holes; blue or pink objects are never coins.</w:t>
             </w:r>
           </w:p>
         </w:tc>

</xml_diff>